<commit_message>
Correção de bugs e adicionada funcionalidade de resetar o formulario
</commit_message>
<xml_diff>
--- a/electron/assets/seeds/CERTIDAO_FUNCIONAL.docx
+++ b/electron/assets/seeds/CERTIDAO_FUNCIONAL.docx
@@ -532,8 +532,6 @@
                 <w:b/>
                 <w:bCs/>
                 <w:color w:val="1F1F1F"/>
-                <w:sz w:val="24"/>
-                <w:szCs w:val="24"/>
               </w:rPr>
             </w:pPr>
             <w:r>
@@ -542,8 +540,6 @@
                 <w:b/>
                 <w:bCs/>
                 <w:color w:val="1F1F1F"/>
-                <w:sz w:val="24"/>
-                <w:szCs w:val="24"/>
               </w:rPr>
               <w:t>Critério de Progressão</w:t>
             </w:r>
@@ -581,8 +577,6 @@
                 <w:b/>
                 <w:bCs/>
                 <w:color w:val="1F1F1F"/>
-                <w:sz w:val="24"/>
-                <w:szCs w:val="24"/>
               </w:rPr>
             </w:pPr>
             <w:r>
@@ -591,8 +585,6 @@
                 <w:b/>
                 <w:bCs/>
                 <w:color w:val="1F1F1F"/>
-                <w:sz w:val="24"/>
-                <w:szCs w:val="24"/>
               </w:rPr>
               <w:t>Posicionamento Atual</w:t>
             </w:r>
@@ -632,8 +624,6 @@
                 <w:b/>
                 <w:bCs/>
                 <w:color w:val="1F1F1F"/>
-                <w:sz w:val="24"/>
-                <w:szCs w:val="24"/>
               </w:rPr>
             </w:pPr>
             <w:r>
@@ -642,8 +632,6 @@
                 <w:b/>
                 <w:bCs/>
                 <w:color w:val="1F1F1F"/>
-                <w:sz w:val="24"/>
-                <w:szCs w:val="24"/>
               </w:rPr>
               <w:t>Progressão Vertical (Nível)</w:t>
             </w:r>
@@ -681,8 +669,6 @@
                 <w:b/>
                 <w:bCs/>
                 <w:color w:val="1F1F1F"/>
-                <w:sz w:val="24"/>
-                <w:szCs w:val="24"/>
               </w:rPr>
             </w:pPr>
             <w:r>
@@ -691,8 +677,6 @@
                 <w:b/>
                 <w:bCs/>
                 <w:color w:val="1F1F1F"/>
-                <w:sz w:val="24"/>
-                <w:szCs w:val="24"/>
               </w:rPr>
               <w:t xml:space="preserve">{{NIVEL}} </w:t>
             </w:r>
@@ -732,8 +716,6 @@
                 <w:b/>
                 <w:bCs/>
                 <w:color w:val="1F1F1F"/>
-                <w:sz w:val="24"/>
-                <w:szCs w:val="24"/>
               </w:rPr>
             </w:pPr>
             <w:r>
@@ -742,8 +724,6 @@
                 <w:b/>
                 <w:bCs/>
                 <w:color w:val="1F1F1F"/>
-                <w:sz w:val="24"/>
-                <w:szCs w:val="24"/>
               </w:rPr>
               <w:t>Progressão Vertical (Subnível)</w:t>
             </w:r>
@@ -781,8 +761,6 @@
                 <w:b/>
                 <w:bCs/>
                 <w:color w:val="1F1F1F"/>
-                <w:sz w:val="24"/>
-                <w:szCs w:val="24"/>
               </w:rPr>
             </w:pPr>
             <w:r>
@@ -791,8 +769,6 @@
                 <w:b/>
                 <w:bCs/>
                 <w:color w:val="1F1F1F"/>
-                <w:sz w:val="24"/>
-                <w:szCs w:val="24"/>
               </w:rPr>
               <w:t>{{SUBNIVEL}}</w:t>
             </w:r>
@@ -832,8 +808,6 @@
                 <w:b/>
                 <w:bCs/>
                 <w:color w:val="1F1F1F"/>
-                <w:sz w:val="24"/>
-                <w:szCs w:val="24"/>
               </w:rPr>
             </w:pPr>
             <w:r>
@@ -842,8 +816,6 @@
                 <w:b/>
                 <w:bCs/>
                 <w:color w:val="1F1F1F"/>
-                <w:sz w:val="24"/>
-                <w:szCs w:val="24"/>
               </w:rPr>
               <w:t>Progressão Horizontal (Letra/Referência)</w:t>
             </w:r>
@@ -881,8 +853,6 @@
                 <w:b/>
                 <w:bCs/>
                 <w:color w:val="1F1F1F"/>
-                <w:sz w:val="24"/>
-                <w:szCs w:val="24"/>
               </w:rPr>
             </w:pPr>
             <w:r>
@@ -891,8 +861,6 @@
                 <w:b/>
                 <w:bCs/>
                 <w:color w:val="1F1F1F"/>
-                <w:sz w:val="24"/>
-                <w:szCs w:val="24"/>
               </w:rPr>
               <w:t>{{LETRA}}</w:t>
             </w:r>
@@ -932,8 +900,6 @@
                 <w:b/>
                 <w:bCs/>
                 <w:color w:val="1F1F1F"/>
-                <w:sz w:val="24"/>
-                <w:szCs w:val="24"/>
               </w:rPr>
             </w:pPr>
             <w:r>
@@ -942,8 +908,6 @@
                 <w:b/>
                 <w:bCs/>
                 <w:color w:val="1F1F1F"/>
-                <w:sz w:val="24"/>
-                <w:szCs w:val="24"/>
               </w:rPr>
               <w:t>Progressão Vertical (Classe)</w:t>
             </w:r>
@@ -981,8 +945,6 @@
                 <w:b/>
                 <w:bCs/>
                 <w:color w:val="1F1F1F"/>
-                <w:sz w:val="24"/>
-                <w:szCs w:val="24"/>
               </w:rPr>
             </w:pPr>
             <w:r>
@@ -991,8 +953,6 @@
                 <w:b/>
                 <w:bCs/>
                 <w:color w:val="1F1F1F"/>
-                <w:sz w:val="24"/>
-                <w:szCs w:val="24"/>
               </w:rPr>
               <w:t>{{CLASSE}}</w:t>
             </w:r>
@@ -1032,8 +992,6 @@
                 <w:b/>
                 <w:bCs/>
                 <w:color w:val="1F1F1F"/>
-                <w:sz w:val="24"/>
-                <w:szCs w:val="24"/>
               </w:rPr>
             </w:pPr>
             <w:r>
@@ -1042,8 +1000,6 @@
                 <w:b/>
                 <w:bCs/>
                 <w:color w:val="1F1F1F"/>
-                <w:sz w:val="24"/>
-                <w:szCs w:val="24"/>
               </w:rPr>
               <w:t>ANUÊNIO</w:t>
             </w:r>
@@ -1081,8 +1037,6 @@
                 <w:b/>
                 <w:bCs/>
                 <w:color w:val="1F1F1F"/>
-                <w:sz w:val="24"/>
-                <w:szCs w:val="24"/>
               </w:rPr>
             </w:pPr>
             <w:r>
@@ -1091,8 +1045,6 @@
                 <w:b/>
                 <w:bCs/>
                 <w:color w:val="1F1F1F"/>
-                <w:sz w:val="24"/>
-                <w:szCs w:val="24"/>
               </w:rPr>
               <w:t>{{ANU</w:t>
             </w:r>
@@ -1102,8 +1054,6 @@
                 <w:b/>
                 <w:bCs/>
                 <w:color w:val="1F1F1F"/>
-                <w:sz w:val="24"/>
-                <w:szCs w:val="24"/>
               </w:rPr>
               <w:t>E</w:t>
             </w:r>
@@ -1113,8 +1063,6 @@
                 <w:b/>
                 <w:bCs/>
                 <w:color w:val="1F1F1F"/>
-                <w:sz w:val="24"/>
-                <w:szCs w:val="24"/>
               </w:rPr>
               <w:t>NIO}}</w:t>
             </w:r>
@@ -1322,7 +1270,6 @@
         <w:rPr>
           <w:color w:val="000000" w:themeColor="text1"/>
         </w:rPr>
-        <w:lastRenderedPageBreak/>
         <w:t>Departamento de Recursos Humanos</w:t>
       </w:r>
     </w:p>

</xml_diff>